<commit_message>
Add v4.0c blueprint and updated AURA Phase 2 report
Co-Authored-By: Claude Sonnet 4.6 <noreply@anthropic.com>
</commit_message>
<xml_diff>
--- a/docs/AURA Progress Report - Phase 2.docx
+++ b/docs/AURA Progress Report - Phase 2.docx
@@ -1604,23 +1604,7 @@
           <w:rFonts w:ascii="Calibri" w:eastAsia="Calibri" w:hAnsi="Calibri" w:cs="Calibri"/>
           <w:color w:val="1F1F1F"/>
         </w:rPr>
-        <w:t xml:space="preserve">The original proposal described a wider system vision that included contactless sensing, multiple food categories, IoT connectivity, and a broader field-deployment narrative. During the current phase, that scope was refined and its implementation sequence was staged for methodological rigor. The execution path is now milk-first, direct-contact, calibration-validated, and laptop-based, with edible oil retained as a secondary extension only after milk repeatability is confirmed. Contactless sensing, mobile-app integration, </w:t>
-      </w:r>
-      <w:proofErr w:type="spellStart"/>
-      <w:r>
-        <w:rPr>
-          <w:rFonts w:ascii="Calibri" w:eastAsia="Calibri" w:hAnsi="Calibri" w:cs="Calibri"/>
-          <w:color w:val="1F1F1F"/>
-        </w:rPr>
-        <w:t>TinyML</w:t>
-      </w:r>
-      <w:proofErr w:type="spellEnd"/>
-      <w:r>
-        <w:rPr>
-          <w:rFonts w:ascii="Calibri" w:eastAsia="Calibri" w:hAnsi="Calibri" w:cs="Calibri"/>
-          <w:color w:val="1F1F1F"/>
-        </w:rPr>
-        <w:t xml:space="preserve"> deployment, and cloud connectivity remain part of the planned system development for the current AURA cycle; however, the present phase prioritizes calibration-validated direct-contact measurement, repeatable real-data acquisition, and reliable baseline inference before these advanced extensions are finalized</w:t>
+        <w:t>The original proposal described a wider system vision that included contactless sensing, multiple food categories, IoT connectivity, and a broader field-deployment narrative. During the current phase, that scope was refined and its implementation sequence was staged for methodological rigor. The execution path is now milk-first, direct-contact, calibration-validated, and laptop-based, with edible oil retained as a secondary extension only after milk repeatability is confirmed. Contactless sensing, mobile-app integration, TinyML deployment, and cloud connectivity remain part of the planned system development for the current AURA cycle; however, the present phase prioritizes calibration-validated direct-contact measurement, repeatable real-data acquisition, and reliable baseline inference before these advanced extensions are finalized</w:t>
       </w:r>
       <w:r>
         <w:rPr>
@@ -1704,23 +1688,7 @@
           <w:rFonts w:ascii="Calibri" w:eastAsia="Calibri" w:hAnsi="Calibri" w:cs="Calibri"/>
           <w:color w:val="1F1F1F"/>
         </w:rPr>
-        <w:t xml:space="preserve">The hardware and software architecture was finalized at the design level. The baseline instrument stack is an AD5933 impedance measurement stage interfaced to an ESP32-class controller, a fixed-geometry direct-contact liquid cell for milk measurements, temperature logging, USB serial transfer to a laptop, and a local Python inference pipeline intended for a </w:t>
-      </w:r>
-      <w:proofErr w:type="spellStart"/>
-      <w:r>
-        <w:rPr>
-          <w:rFonts w:ascii="Calibri" w:eastAsia="Calibri" w:hAnsi="Calibri" w:cs="Calibri"/>
-          <w:color w:val="1F1F1F"/>
-        </w:rPr>
-        <w:t>Streamlit</w:t>
-      </w:r>
-      <w:proofErr w:type="spellEnd"/>
-      <w:r>
-        <w:rPr>
-          <w:rFonts w:ascii="Calibri" w:eastAsia="Calibri" w:hAnsi="Calibri" w:cs="Calibri"/>
-          <w:color w:val="1F1F1F"/>
-        </w:rPr>
-        <w:t>-based demonstration. This replaces the earlier emphasis on browser/mobile-first deployment and places measurement repeatability, calibration, and debugging convenience at the center of the prototype plan</w:t>
+        <w:t>The hardware and software architecture was finalized at the design level. The baseline instrument stack is an AD5933 impedance measurement stage interfaced to an ESP32-class controller, a fixed-geometry direct-contact liquid cell for milk measurements, temperature logging, USB serial transfer to a laptop, and a local Python inference pipeline intended for a Streamlit-based demonstration. This replaces the earlier emphasis on browser/mobile-first deployment and places measurement repeatability, calibration, and debugging convenience at the center of the prototype plan</w:t>
       </w:r>
       <w:r>
         <w:rPr>
@@ -1859,7 +1827,7 @@
           <w:rFonts w:ascii="Calibri" w:eastAsia="Calibri" w:hAnsi="Calibri" w:cs="Calibri"/>
           <w:color w:val="1F1F1F"/>
         </w:rPr>
-        <w:t>Project repository: [</w:t>
+        <w:t xml:space="preserve">Project repository: </w:t>
       </w:r>
       <w:hyperlink r:id="rId7" w:history="1">
         <w:r>
@@ -1870,13 +1838,6 @@
           <w:t>https://github.com/2412434-tipu/EISight</w:t>
         </w:r>
       </w:hyperlink>
-      <w:r>
-        <w:rPr>
-          <w:rFonts w:ascii="Calibri" w:eastAsia="Calibri" w:hAnsi="Calibri" w:cs="Calibri"/>
-          <w:color w:val="1F1F1F"/>
-        </w:rPr>
-        <w:t>]</w:t>
-      </w:r>
     </w:p>
     <w:p>
       <w:pPr>
@@ -2084,15 +2045,7 @@
           <w:b/>
           <w:bCs/>
         </w:rPr>
-        <w:t>Methodology Revision Based on Domain-Shift Risk Analysis</w:t>
-      </w:r>
-      <w:r>
-        <w:rPr>
-          <w:rFonts w:asciiTheme="majorHAnsi" w:hAnsiTheme="majorHAnsi" w:cstheme="majorHAnsi"/>
-          <w:b/>
-          <w:bCs/>
-        </w:rPr>
-        <w:t xml:space="preserve">: </w:t>
+        <w:t xml:space="preserve">Methodology Revision Based on Domain-Shift Risk Analysis: </w:t>
       </w:r>
     </w:p>
     <w:p>
@@ -2148,43 +2101,21 @@
           <w:b/>
           <w:bCs/>
         </w:rPr>
-        <w:t>Hardware Procurement</w:t>
-      </w:r>
-      <w:r>
+        <w:t xml:space="preserve">Hardware Procurement: </w:t>
+      </w:r>
+    </w:p>
+    <w:p>
+      <w:pPr>
+        <w:pStyle w:val="ListParagraph"/>
         <w:rPr>
           <w:rFonts w:asciiTheme="majorHAnsi" w:hAnsiTheme="majorHAnsi" w:cstheme="majorHAnsi"/>
-          <w:b/>
-          <w:bCs/>
-        </w:rPr>
-        <w:t xml:space="preserve">: </w:t>
-      </w:r>
-    </w:p>
-    <w:p>
-      <w:pPr>
-        <w:pStyle w:val="ListParagraph"/>
+        </w:rPr>
+      </w:pPr>
+      <w:r>
         <w:rPr>
           <w:rFonts w:asciiTheme="majorHAnsi" w:hAnsiTheme="majorHAnsi" w:cstheme="majorHAnsi"/>
         </w:rPr>
-      </w:pPr>
-      <w:r>
-        <w:rPr>
-          <w:rFonts w:asciiTheme="majorHAnsi" w:hAnsiTheme="majorHAnsi" w:cstheme="majorHAnsi"/>
-        </w:rPr>
-        <w:t xml:space="preserve">AD5933 breakout modules and ESP32 microcontrollers are being sourced from China through an international purchase channel because the AD5933 is not available in Bangladeshi electronics markets. Local procurement has started </w:t>
-      </w:r>
-      <w:proofErr w:type="gramStart"/>
-      <w:r>
-        <w:rPr>
-          <w:rFonts w:asciiTheme="majorHAnsi" w:hAnsiTheme="majorHAnsi" w:cstheme="majorHAnsi"/>
-        </w:rPr>
-        <w:t>for supporting</w:t>
-      </w:r>
-      <w:proofErr w:type="gramEnd"/>
-      <w:r>
-        <w:rPr>
-          <w:rFonts w:asciiTheme="majorHAnsi" w:hAnsiTheme="majorHAnsi" w:cstheme="majorHAnsi"/>
-        </w:rPr>
-        <w:t xml:space="preserve"> items such as temperature sensors, electrode materials, and precision calibration resistors. Hardware integration and real data collection have therefore not yet begun, but procurement planning and readiness work have been completed</w:t>
+        <w:t>AD5933 breakout modules and ESP32 microcontrollers are being sourced from China through an international purchase channel because the AD5933 is not available in Bangladeshi electronics markets. Local procurement has started for supporting items such as temperature sensors, electrode materials, and precision calibration resistors. Hardware integration and real data collection have therefore not yet begun, but procurement planning and readiness work have been completed</w:t>
       </w:r>
       <w:r>
         <w:rPr>
@@ -2428,7 +2359,7 @@
           <w:bCs/>
           <w:color w:val="1F1F1F"/>
         </w:rPr>
-        <w:t>Scope overreach in the original proposal</w:t>
+        <w:t>Scope refinement from proposal to execution</w:t>
       </w:r>
     </w:p>
     <w:p>
@@ -2626,39 +2557,7 @@
           <w:rFonts w:ascii="Calibri" w:eastAsia="Calibri" w:hAnsi="Calibri" w:cs="Calibri"/>
           <w:color w:val="1F1F1F"/>
         </w:rPr>
-        <w:t xml:space="preserve">The implementation sequence was refined to prioritize a milk-first, direct-contact, calibration-validated prototype while continuing broader features in staged development. Edible oil remains a secondary target, and contactless sensing, mobile-app integration, </w:t>
-      </w:r>
-      <w:proofErr w:type="spellStart"/>
-      <w:r>
-        <w:rPr>
-          <w:rFonts w:ascii="Calibri" w:eastAsia="Calibri" w:hAnsi="Calibri" w:cs="Calibri"/>
-          <w:color w:val="1F1F1F"/>
-        </w:rPr>
-        <w:t>TinyML</w:t>
-      </w:r>
-      <w:proofErr w:type="spellEnd"/>
-      <w:r>
-        <w:rPr>
-          <w:rFonts w:ascii="Calibri" w:eastAsia="Calibri" w:hAnsi="Calibri" w:cs="Calibri"/>
-          <w:color w:val="1F1F1F"/>
-        </w:rPr>
-        <w:t xml:space="preserve">, and cloud connectivity continue to be pursued within the current AURA cycle without taking priority </w:t>
-      </w:r>
-      <w:proofErr w:type="gramStart"/>
-      <w:r>
-        <w:rPr>
-          <w:rFonts w:ascii="Calibri" w:eastAsia="Calibri" w:hAnsi="Calibri" w:cs="Calibri"/>
-          <w:color w:val="1F1F1F"/>
-        </w:rPr>
-        <w:t>over core</w:t>
-      </w:r>
-      <w:proofErr w:type="gramEnd"/>
-      <w:r>
-        <w:rPr>
-          <w:rFonts w:ascii="Calibri" w:eastAsia="Calibri" w:hAnsi="Calibri" w:cs="Calibri"/>
-          <w:color w:val="1F1F1F"/>
-        </w:rPr>
-        <w:t xml:space="preserve"> measurement validation</w:t>
+        <w:t>The implementation sequence was refined to prioritize a milk-first, direct-contact, calibration-validated prototype while continuing broader features in staged development. Edible oil remains a secondary target, and contactless sensing, mobile-app integration, TinyML, and cloud connectivity continue to be pursued within the current AURA cycle without taking priority over core measurement validation</w:t>
       </w:r>
       <w:r>
         <w:rPr>
@@ -2869,29 +2768,7 @@
           <w:sz w:val="22"/>
           <w:szCs w:val="22"/>
         </w:rPr>
-        <w:t xml:space="preserve">Broader system features such as mobile-app integration and cloud connectivity are documented in the project architecture but will not be </w:t>
-      </w:r>
-      <w:r>
-        <w:rPr>
-          <w:rFonts w:ascii="Calibri" w:eastAsia="Calibri" w:hAnsi="Calibri" w:cs="Calibri"/>
-          <w:b w:val="0"/>
-          <w:bCs w:val="0"/>
-          <w:color w:val="1F1F1F"/>
-          <w:sz w:val="22"/>
-          <w:szCs w:val="22"/>
-        </w:rPr>
-        <w:t>prioritized</w:t>
-      </w:r>
-      <w:r>
-        <w:rPr>
-          <w:rFonts w:ascii="Calibri" w:eastAsia="Calibri" w:hAnsi="Calibri" w:cs="Calibri"/>
-          <w:b w:val="0"/>
-          <w:bCs w:val="0"/>
-          <w:color w:val="1F1F1F"/>
-          <w:sz w:val="22"/>
-          <w:szCs w:val="22"/>
-        </w:rPr>
-        <w:t xml:space="preserve"> until the core measurement chain is validated</w:t>
+        <w:t>Broader system features such as mobile-app integration and cloud connectivity are documented in the project architecture but will not be prioritized until the core measurement chain is validated</w:t>
       </w:r>
       <w:r>
         <w:rPr>
@@ -2953,31 +2830,7 @@
           <w:sz w:val="22"/>
           <w:szCs w:val="22"/>
         </w:rPr>
-        <w:t xml:space="preserve">Real milk adulteration data collection will begin with water dilution only, using controlled concentration levels across at least three separate days. Urea and baking soda classes will be attempted only if the water-dilution baseline is stable and repeatable. The real-data phase will include calibration-aware preprocessing, grouped validation, model retraining, and development of a local </w:t>
-      </w:r>
-      <w:proofErr w:type="spellStart"/>
-      <w:r>
-        <w:rPr>
-          <w:rFonts w:ascii="Calibri" w:eastAsia="Calibri" w:hAnsi="Calibri" w:cs="Calibri"/>
-          <w:b w:val="0"/>
-          <w:bCs w:val="0"/>
-          <w:color w:val="1F1F1F"/>
-          <w:sz w:val="22"/>
-          <w:szCs w:val="22"/>
-        </w:rPr>
-        <w:t>Streamlit</w:t>
-      </w:r>
-      <w:proofErr w:type="spellEnd"/>
-      <w:r>
-        <w:rPr>
-          <w:rFonts w:ascii="Calibri" w:eastAsia="Calibri" w:hAnsi="Calibri" w:cs="Calibri"/>
-          <w:b w:val="0"/>
-          <w:bCs w:val="0"/>
-          <w:color w:val="1F1F1F"/>
-          <w:sz w:val="22"/>
-          <w:szCs w:val="22"/>
-        </w:rPr>
-        <w:t xml:space="preserve"> demonstration in which the ESP32 streams data over USB serial to a laptop-based inference pipeline. Blind-sample testing prepared by another team member is planned after the first stable dataset is obtained. </w:t>
+        <w:t xml:space="preserve">Real milk adulteration data collection will begin with water dilution only, using controlled concentration levels across at least three separate days. Urea and baking soda classes will be attempted only if the water-dilution baseline is stable and repeatable. The real-data phase will include calibration-aware preprocessing, grouped validation, model retraining, and development of a local Streamlit demonstration in which the ESP32 streams data over USB serial to a laptop-based inference pipeline. Blind-sample testing prepared by another team member is planned after the first stable dataset is obtained. </w:t>
       </w:r>
       <w:r>
         <w:rPr>

</xml_diff>